<commit_message>
Dossier de conception générale version finale
</commit_message>
<xml_diff>
--- a/Dossier de conception générale vc.docx
+++ b/Dossier de conception générale vc.docx
@@ -1467,9 +1467,9 @@
           <w:szCs w:val="24"/>
         </w:rPr>
         <w:drawing>
-          <wp:inline distT="0" distB="0" distL="0" distR="0" wp14:anchorId="0E13AFD1" wp14:editId="30EDA7FE">
-            <wp:extent cx="5814124" cy="6080760"/>
-            <wp:effectExtent l="0" t="0" r="0" b="0"/>
+          <wp:inline distT="0" distB="0" distL="0" distR="0" wp14:anchorId="2D36F445" wp14:editId="40A00913">
+            <wp:extent cx="6120130" cy="5726430"/>
+            <wp:effectExtent l="0" t="0" r="0" b="7620"/>
             <wp:docPr id="1" name="Image 1"/>
             <wp:cNvGraphicFramePr>
               <a:graphicFrameLocks xmlns:a="http://schemas.openxmlformats.org/drawingml/2006/main" noChangeAspect="1"/>
@@ -1481,27 +1481,20 @@
                     <pic:cNvPr id="1" name=""/>
                     <pic:cNvPicPr/>
                   </pic:nvPicPr>
-                  <pic:blipFill rotWithShape="1">
+                  <pic:blipFill>
                     <a:blip r:embed="rId8"/>
-                    <a:srcRect t="2259" b="2853"/>
-                    <a:stretch/>
+                    <a:stretch>
+                      <a:fillRect/>
+                    </a:stretch>
                   </pic:blipFill>
-                  <pic:spPr bwMode="auto">
+                  <pic:spPr>
                     <a:xfrm>
                       <a:off x="0" y="0"/>
-                      <a:ext cx="5818140" cy="6084960"/>
+                      <a:ext cx="6120130" cy="5726430"/>
                     </a:xfrm>
                     <a:prstGeom prst="rect">
                       <a:avLst/>
                     </a:prstGeom>
-                    <a:ln>
-                      <a:noFill/>
-                    </a:ln>
-                    <a:extLst>
-                      <a:ext uri="{53640926-AAD7-44D8-BBD7-CCE9431645EC}">
-                        <a14:shadowObscured xmlns:a14="http://schemas.microsoft.com/office/drawing/2010/main"/>
-                      </a:ext>
-                    </a:extLst>
                   </pic:spPr>
                 </pic:pic>
               </a:graphicData>
@@ -1513,6 +1506,9 @@
     <w:p>
       <w:pPr>
         <w:pStyle w:val="Titre2"/>
+        <w:tabs>
+          <w:tab w:val="left" w:pos="6540"/>
+        </w:tabs>
         <w:spacing w:before="300" w:after="150" w:line="360" w:lineRule="auto"/>
         <w:ind w:firstLine="708"/>
         <w:jc w:val="both"/>
@@ -1552,6 +1548,16 @@
       <w:bookmarkEnd w:id="31"/>
       <w:bookmarkEnd w:id="32"/>
       <w:bookmarkEnd w:id="33"/>
+      <w:r>
+        <w:rPr>
+          <w:rFonts w:eastAsia="Calibri"/>
+          <w:b/>
+          <w:bCs/>
+          <w:sz w:val="28"/>
+          <w:szCs w:val="28"/>
+        </w:rPr>
+        <w:tab/>
+      </w:r>
     </w:p>
     <w:p>
       <w:pPr>
@@ -2084,19 +2090,7 @@
         <w:jc w:val="both"/>
       </w:pPr>
       <w:r>
-        <w:t>Deux approches étaient possibles : recalculer le solde à partir de la somme des opérations à chaque lecture, ou le stocker directement sur la tirelire et le mettre à jour à chaque opération. Le solde stocké a été retenu pour des raisons de performance : recalculer l'historique complet des opérations à chaque consultation du solde a un coût qui croît avec le nombre d'opérations enregistrées, alors qu'une lecture d'un champ stocké s'effectue en temps constant, quel que soit le volume d'opérations passées. La contrepartie de ce choix</w:t>
-      </w:r>
-      <w:r>
-        <w:t xml:space="preserve"> qui était </w:t>
-      </w:r>
-      <w:r>
-        <w:t>le risque de désynchronisation entre le solde stocké et l'historique des opérations</w:t>
-      </w:r>
-      <w:r>
-        <w:t xml:space="preserve"> </w:t>
-      </w:r>
-      <w:r>
-        <w:t>est maîtrisée en garantissant que chaque mise à jour du solde s'effectue dans la même transaction atomique que l'enregistrement de l'opération correspondante.</w:t>
+        <w:t>Deux approches étaient possibles : recalculer le solde à partir de la somme des opérations à chaque lecture, ou le stocker directement sur la tirelire et le mettre à jour à chaque opération. Le solde stocké a été retenu pour des raisons de performance : recalculer l'historique complet des opérations à chaque consultation du solde a un coût qui croît avec le nombre d'opérations enregistrées, alors qu'une lecture d'un champ stocké s'effectue en temps constant, quel que soit le volume d'opérations passées. La contrepartie de ce choix qui était le risque de désynchronisation entre le solde stocké et l'historique des opérations est maîtrisée en garantissant que chaque mise à jour du solde s'effectue dans la même transaction atomique que l'enregistrement de l'opération correspondante.</w:t>
       </w:r>
     </w:p>
     <w:p>
@@ -2233,7 +2227,21 @@
           <w:sz w:val="24"/>
           <w:szCs w:val="24"/>
         </w:rPr>
-        <w:t>Les vues interceptent ces exceptions et les traduisent en réponse HTTP avec un code approprié (400, 404) et un message explicite, conformément au contrat d'API.</w:t>
+        <w:t xml:space="preserve">Les vues interceptent ces exceptions et les traduisent en réponse HTTP avec un code approprié (400, </w:t>
+      </w:r>
+      <w:r>
+        <w:rPr>
+          <w:sz w:val="24"/>
+          <w:szCs w:val="24"/>
+        </w:rPr>
+        <w:t xml:space="preserve">403, </w:t>
+      </w:r>
+      <w:r>
+        <w:rPr>
+          <w:sz w:val="24"/>
+          <w:szCs w:val="24"/>
+        </w:rPr>
+        <w:t>404) et un message explicite, conformément au contrat d'API.</w:t>
       </w:r>
     </w:p>
     <w:tbl>
@@ -2267,14 +2275,7 @@
                 <w:sz w:val="24"/>
                 <w:szCs w:val="24"/>
               </w:rPr>
-              <w:t>Exception</w:t>
-            </w:r>
-            <w:r>
-              <w:rPr>
-                <w:sz w:val="24"/>
-                <w:szCs w:val="24"/>
-              </w:rPr>
-              <w:t xml:space="preserve"> </w:t>
+              <w:t xml:space="preserve">Exception </w:t>
             </w:r>
           </w:p>
         </w:tc>
@@ -2743,14 +2744,7 @@
                 <w:sz w:val="24"/>
                 <w:szCs w:val="24"/>
               </w:rPr>
-              <w:t>40</w:t>
-            </w:r>
-            <w:r>
-              <w:rPr>
-                <w:sz w:val="24"/>
-                <w:szCs w:val="24"/>
-              </w:rPr>
-              <w:t>0</w:t>
+              <w:t>400</w:t>
             </w:r>
           </w:p>
         </w:tc>
@@ -2863,14 +2857,7 @@
                 <w:sz w:val="24"/>
                 <w:szCs w:val="24"/>
               </w:rPr>
-              <w:t>40</w:t>
-            </w:r>
-            <w:r>
-              <w:rPr>
-                <w:sz w:val="24"/>
-                <w:szCs w:val="24"/>
-              </w:rPr>
-              <w:t>4</w:t>
+              <w:t>404</w:t>
             </w:r>
           </w:p>
         </w:tc>
@@ -2967,7 +2954,7 @@
                 <w:sz w:val="24"/>
                 <w:szCs w:val="24"/>
               </w:rPr>
-              <w:t>4</w:t>
+              <w:t>3</w:t>
             </w:r>
           </w:p>
         </w:tc>

</xml_diff>

<commit_message>
Dossier de conception générale version finale finale
</commit_message>
<xml_diff>
--- a/Dossier de conception générale vc.docx
+++ b/Dossier de conception générale vc.docx
@@ -1467,9 +1467,9 @@
           <w:szCs w:val="24"/>
         </w:rPr>
         <w:drawing>
-          <wp:inline distT="0" distB="0" distL="0" distR="0" wp14:anchorId="2D36F445" wp14:editId="40A00913">
-            <wp:extent cx="6120130" cy="5726430"/>
-            <wp:effectExtent l="0" t="0" r="0" b="7620"/>
+          <wp:inline distT="0" distB="0" distL="0" distR="0" wp14:anchorId="06754168" wp14:editId="242355C8">
+            <wp:extent cx="5773708" cy="6096000"/>
+            <wp:effectExtent l="0" t="0" r="0" b="0"/>
             <wp:docPr id="1" name="Image 1"/>
             <wp:cNvGraphicFramePr>
               <a:graphicFrameLocks xmlns:a="http://schemas.openxmlformats.org/drawingml/2006/main" noChangeAspect="1"/>
@@ -1481,20 +1481,27 @@
                     <pic:cNvPr id="1" name=""/>
                     <pic:cNvPicPr/>
                   </pic:nvPicPr>
-                  <pic:blipFill>
+                  <pic:blipFill rotWithShape="1">
                     <a:blip r:embed="rId8"/>
-                    <a:stretch>
-                      <a:fillRect/>
-                    </a:stretch>
+                    <a:srcRect t="2940" b="1150"/>
+                    <a:stretch/>
                   </pic:blipFill>
-                  <pic:spPr>
+                  <pic:spPr bwMode="auto">
                     <a:xfrm>
                       <a:off x="0" y="0"/>
-                      <a:ext cx="6120130" cy="5726430"/>
+                      <a:ext cx="5780535" cy="6103208"/>
                     </a:xfrm>
                     <a:prstGeom prst="rect">
                       <a:avLst/>
                     </a:prstGeom>
+                    <a:ln>
+                      <a:noFill/>
+                    </a:ln>
+                    <a:extLst>
+                      <a:ext uri="{53640926-AAD7-44D8-BBD7-CCE9431645EC}">
+                        <a14:shadowObscured xmlns:a14="http://schemas.microsoft.com/office/drawing/2010/main"/>
+                      </a:ext>
+                    </a:extLst>
                   </pic:spPr>
                 </pic:pic>
               </a:graphicData>

</xml_diff>